<commit_message>
feat: complete Phase 5 & 6 with recursive PDF generation and PPTX backups
</commit_message>
<xml_diff>
--- a/Phase 5/Phase 5 Deep Learning, Computer Vision & LLMs.docx
+++ b/Phase 5/Phase 5 Deep Learning, Computer Vision & LLMs.docx
@@ -1078,13 +1078,7 @@
         <w:t xml:space="preserve"> Allowing the model to focus on different parts of a sentence simultaneously.</w:t>
       </w:r>
     </w:p>
-    <w:p>
-      <w:r>
-        <w:pict w14:anchorId="0FD4248F">
-          <v:rect id="_x0000_i1025" style="width:0;height:1.5pt" o:hralign="center" o:hrstd="t" o:hr="t" fillcolor="#a0a0a0" stroked="f"/>
-        </w:pict>
-      </w:r>
-    </w:p>
+    <w:p/>
     <w:p>
       <w:pPr>
         <w:pStyle w:val="Heading1"/>
@@ -10681,6 +10675,7 @@
   <w:style w:type="character" w:default="1" w:styleId="DefaultParagraphFont">
     <w:name w:val="Default Paragraph Font"/>
     <w:uiPriority w:val="1"/>
+    <w:semiHidden/>
     <w:unhideWhenUsed/>
   </w:style>
   <w:style w:type="table" w:default="1" w:styleId="TableNormal">

</xml_diff>